<commit_message>
Add async lockout emails & multipart evidence upload
Convert AuthProtectionService to async: RecordFailed/RecordSuccessful login methods are now async and awaited across API and web handlers. Add email-based lockout notifications for account and network lockouts (sent only to linked Google emails when SMTP configured), including recipient resolution and templated messages. Implement multipart form handling for tenant SMS dispatch evidence: accept form files/named fields, upload batch via IImageUploadService, persist evidence and events, and disable antiforgery for that endpoint. Add a new customer audit scope and permission checks for customer portal audit access. Update VSCode launch configs to use pwa-node with a tiny exit helper script and adjust publish PowerShell path/exit behavior. Minor docs updated to document lockout alert behavior. (Also includes incidental build/obj binary metadata and new ImagePreviewModal frontend file.)
</commit_message>
<xml_diff>
--- a/docs/Deliverables/IT16/Project Overview Documentation.docx
+++ b/docs/Deliverables/IT16/Project Overview Documentation.docx
@@ -1003,25 +1003,6 @@
     </w:p>
     <w:p>
       <w:pPr>
-        <w:numPr>
-          <w:ilvl w:val="0"/>
-          <w:numId w:val="5"/>
-        </w:numPr>
-        <w:spacing w:after="0" w:line="276" w:lineRule="auto"/>
-        <w:rPr>
-          <w:rFonts w:ascii="Arial" w:hAnsi="Arial" w:cs="Arial"/>
-        </w:rPr>
-      </w:pPr>
-      <w:r>
-        <w:rPr>
-          <w:rFonts w:ascii="Arial" w:hAnsi="Arial" w:cs="Arial"/>
-        </w:rPr>
-        <w:lastRenderedPageBreak/>
-        <w:t>Future improvement: replace broad role-name checks with a formal permission matrix and enforce subscription/module entitlements as a security boundary.</w:t>
-      </w:r>
-    </w:p>
-    <w:p>
-      <w:pPr>
         <w:spacing w:after="0" w:line="240" w:lineRule="auto"/>
         <w:rPr>
           <w:rFonts w:ascii="Arial" w:hAnsi="Arial" w:cs="Arial"/>
@@ -1036,12 +1017,22 @@
           <w:bCs/>
         </w:rPr>
       </w:pPr>
-      <w:r>
+    </w:p>
+    <w:p>
+      <w:pPr>
         <w:rPr>
           <w:rFonts w:ascii="Arial" w:hAnsi="Arial" w:cs="Arial"/>
           <w:b/>
           <w:bCs/>
         </w:rPr>
+      </w:pPr>
+      <w:r>
+        <w:rPr>
+          <w:rFonts w:ascii="Arial" w:hAnsi="Arial" w:cs="Arial"/>
+          <w:b/>
+          <w:bCs/>
+        </w:rPr>
+        <w:lastRenderedPageBreak/>
         <w:t>Logging and Monitoring Policy</w:t>
       </w:r>
     </w:p>
@@ -1372,7 +1363,7 @@
           <w:rFonts w:ascii="Arial" w:hAnsi="Arial" w:cs="Arial"/>
         </w:rPr>
         <w:pict w14:anchorId="68A46EDA">
-          <v:rect id="_x0000_i1031" style="width:0;height:3pt" o:hralign="center" o:hrstd="t" o:hr="t" fillcolor="#a0a0a0" stroked="f"/>
+          <v:rect id="_x0000_i1025" style="width:0;height:3pt" o:hralign="center" o:hrstd="t" o:hr="t" fillcolor="#a0a0a0" stroked="f"/>
         </w:pict>
       </w:r>
     </w:p>
@@ -1444,21 +1435,21 @@
           <w:b/>
           <w:bCs/>
         </w:rPr>
+        <w:t>Reporting</w:t>
+      </w:r>
+    </w:p>
+    <w:p>
+      <w:pPr>
+        <w:jc w:val="both"/>
+        <w:rPr>
+          <w:rFonts w:ascii="Arial" w:hAnsi="Arial" w:cs="Arial"/>
+        </w:rPr>
+      </w:pPr>
+      <w:r>
+        <w:rPr>
+          <w:rFonts w:ascii="Arial" w:hAnsi="Arial" w:cs="Arial"/>
+        </w:rPr>
         <w:lastRenderedPageBreak/>
-        <w:t>Reporting</w:t>
-      </w:r>
-    </w:p>
-    <w:p>
-      <w:pPr>
-        <w:jc w:val="both"/>
-        <w:rPr>
-          <w:rFonts w:ascii="Arial" w:hAnsi="Arial" w:cs="Arial"/>
-        </w:rPr>
-      </w:pPr>
-      <w:r>
-        <w:rPr>
-          <w:rFonts w:ascii="Arial" w:hAnsi="Arial" w:cs="Arial"/>
-        </w:rPr>
         <w:tab/>
       </w:r>
       <w:r>
@@ -1986,7 +1977,6 @@
           <w:b/>
           <w:bCs/>
         </w:rPr>
-        <w:lastRenderedPageBreak/>
         <w:t>Access Control (RBAC / ACL)</w:t>
       </w:r>
     </w:p>
@@ -2004,6 +1994,7 @@
           <w:b/>
           <w:bCs/>
         </w:rPr>
+        <w:lastRenderedPageBreak/>
         <w:t>Intended Users</w:t>
       </w:r>
     </w:p>
@@ -2117,6 +2108,14 @@
         </w:rPr>
         <w:t>: root platform administrators who manage platform-level configuration, tenants, subscription/module setup, audit views, and root account operations.</w:t>
       </w:r>
+    </w:p>
+    <w:p>
+      <w:pPr>
+        <w:spacing w:after="0" w:line="240" w:lineRule="auto"/>
+        <w:rPr>
+          <w:rFonts w:ascii="Arial" w:hAnsi="Arial" w:cs="Arial"/>
+        </w:rPr>
+      </w:pPr>
     </w:p>
     <w:p>
       <w:pPr>
@@ -7828,6 +7827,7 @@
   <w:style w:type="character" w:default="1" w:styleId="DefaultParagraphFont">
     <w:name w:val="Default Paragraph Font"/>
     <w:uiPriority w:val="1"/>
+    <w:semiHidden/>
     <w:unhideWhenUsed/>
   </w:style>
   <w:style w:type="table" w:default="1" w:styleId="TableNormal">

</xml_diff>